<commit_message>
Add revolution, room chat and clearer table indicators
</commit_message>
<xml_diff>
--- a/docs/三五反规则_完善版.docx
+++ b/docs/三五反规则_完善版.docx
@@ -95,7 +95,7 @@
         <w:rPr>
           <w:b w:val="0"/>
         </w:rPr>
-        <w:t>⑤ 庄家扣底。从18张手牌中选6张不带分的牌，牌面向下扣好，剩12张手牌。</w:t>
+        <w:t>⑤ 庄家扣底。从18张手牌中选6张不带分的牌，扣下后向全桌公开，剩12张手牌。</w:t>
       </w:r>
     </w:p>
     <w:p>
@@ -112,6 +112,11 @@
           <w:b w:val="0"/>
         </w:rPr>
         <w:t>⑦ 结算本局。合计闲家方抓到的分数，确定下一局庄家和进贡义务，再进入下一局。</w:t>
+      </w:r>
+    </w:p>
+    <w:p>
+      <w:r>
+        <w:t>革命：每人12张手牌发完后，任意一家手中没有任何5、10、K，可以在进贡和庄家拿底前选择革命。整桌比赛回到首局，清除进贡义务并重新洗牌，先给原庄家发牌，再由首局亮2重新定庄。革命由持牌者自行选择，也可继续本局。</w:t>
       </w:r>
     </w:p>
     <w:p>
@@ -1007,7 +1012,7 @@
         <w:rPr>
           <w:b w:val="0"/>
         </w:rPr>
-        <w:t>扣好的底牌牌面向下放置，本局不参与正常出牌。由于底牌没有分牌，正常打出的分牌总分仍为100分。扣牌数量和禁扣分牌应在开牌前检查。</w:t>
+        <w:t>扣好的底牌向全桌公开，本局不参与正常出牌。由于底牌没有分牌，正常打出的分牌总分仍为100分。扣牌数量和禁扣分牌应在开牌前检查。</w:t>
       </w:r>
     </w:p>
     <w:p>

</xml_diff>